<commit_message>
bổ sung lab 8 và readme
</commit_message>
<xml_diff>
--- a/LAB8/11_ĐH_CNPM2-LAB8_1150080113-ChauThiNgocQuyen.docx
+++ b/LAB8/11_ĐH_CNPM2-LAB8_1150080113-ChauThiNgocQuyen.docx
@@ -50,7 +50,7 @@
       </w:r>
       <w:r>
         <w:rPr>
-          <w:rStyle w:val="4"/>
+          <w:rStyle w:val="6"/>
           <w:rFonts w:hint="default" w:ascii="Times New Roman" w:hAnsi="Times New Roman" w:cs="Times New Roman"/>
           <w:sz w:val="26"/>
           <w:szCs w:val="26"/>
@@ -78,8 +78,6 @@
           <w:lang w:val="en-US"/>
         </w:rPr>
       </w:pPr>
-      <w:bookmarkStart w:id="0" w:name="_GoBack"/>
-      <w:bookmarkEnd w:id="0"/>
     </w:p>
     <w:p>
       <w:pPr>
@@ -103,7 +101,7 @@
     </w:p>
     <w:tbl>
       <w:tblPr>
-        <w:tblStyle w:val="5"/>
+        <w:tblStyle w:val="7"/>
         <w:tblW w:w="0" w:type="auto"/>
         <w:tblInd w:w="0" w:type="dxa"/>
         <w:tblBorders>
@@ -116,7 +114,9 @@
         </w:tblBorders>
         <w:tblLayout w:type="autofit"/>
         <w:tblCellMar>
+          <w:top w:w="0" w:type="dxa"/>
           <w:left w:w="108" w:type="dxa"/>
+          <w:bottom w:w="0" w:type="dxa"/>
           <w:right w:w="108" w:type="dxa"/>
         </w:tblCellMar>
       </w:tblPr>
@@ -135,7 +135,9 @@
             <w:insideV w:val="single" w:color="auto" w:sz="4" w:space="0"/>
           </w:tblBorders>
           <w:tblCellMar>
+            <w:top w:w="0" w:type="dxa"/>
             <w:left w:w="108" w:type="dxa"/>
+            <w:bottom w:w="0" w:type="dxa"/>
             <w:right w:w="108" w:type="dxa"/>
           </w:tblCellMar>
         </w:tblPrEx>
@@ -145,6 +147,7 @@
           </w:tcPr>
           <w:p>
             <w:pPr>
+              <w:widowControl w:val="0"/>
               <w:jc w:val="both"/>
               <w:rPr>
                 <w:rFonts w:hint="default" w:ascii="Times New Roman" w:hAnsi="Times New Roman" w:cs="Times New Roman"/>
@@ -172,6 +175,7 @@
           </w:tcPr>
           <w:p>
             <w:pPr>
+              <w:widowControl w:val="0"/>
               <w:jc w:val="both"/>
               <w:rPr>
                 <w:rFonts w:hint="default" w:ascii="Times New Roman" w:hAnsi="Times New Roman" w:cs="Times New Roman"/>
@@ -205,7 +209,9 @@
             <w:insideV w:val="single" w:color="auto" w:sz="4" w:space="0"/>
           </w:tblBorders>
           <w:tblCellMar>
+            <w:top w:w="0" w:type="dxa"/>
             <w:left w:w="108" w:type="dxa"/>
+            <w:bottom w:w="0" w:type="dxa"/>
             <w:right w:w="108" w:type="dxa"/>
           </w:tblCellMar>
         </w:tblPrEx>
@@ -215,6 +221,7 @@
           </w:tcPr>
           <w:p>
             <w:pPr>
+              <w:widowControl w:val="0"/>
               <w:jc w:val="both"/>
               <w:rPr>
                 <w:rFonts w:hint="default" w:ascii="Times New Roman" w:hAnsi="Times New Roman" w:cs="Times New Roman"/>
@@ -242,6 +249,7 @@
           </w:tcPr>
           <w:p>
             <w:pPr>
+              <w:widowControl w:val="0"/>
               <w:jc w:val="both"/>
               <w:rPr>
                 <w:rFonts w:hint="default" w:ascii="Times New Roman" w:hAnsi="Times New Roman" w:cs="Times New Roman"/>
@@ -275,7 +283,9 @@
             <w:insideV w:val="single" w:color="auto" w:sz="4" w:space="0"/>
           </w:tblBorders>
           <w:tblCellMar>
+            <w:top w:w="0" w:type="dxa"/>
             <w:left w:w="108" w:type="dxa"/>
+            <w:bottom w:w="0" w:type="dxa"/>
             <w:right w:w="108" w:type="dxa"/>
           </w:tblCellMar>
         </w:tblPrEx>
@@ -285,6 +295,7 @@
           </w:tcPr>
           <w:p>
             <w:pPr>
+              <w:widowControl w:val="0"/>
               <w:jc w:val="both"/>
               <w:rPr>
                 <w:rFonts w:hint="default" w:ascii="Times New Roman" w:hAnsi="Times New Roman" w:cs="Times New Roman"/>
@@ -312,6 +323,7 @@
           </w:tcPr>
           <w:p>
             <w:pPr>
+              <w:widowControl w:val="0"/>
               <w:jc w:val="both"/>
               <w:rPr>
                 <w:rFonts w:hint="default" w:ascii="Times New Roman" w:hAnsi="Times New Roman" w:cs="Times New Roman"/>
@@ -324,8 +336,8 @@
             <w:r>
               <w:rPr>
                 <w:rFonts w:hint="default" w:ascii="Times New Roman" w:hAnsi="Times New Roman" w:eastAsia="SimSun" w:cs="Times New Roman"/>
-                <w:sz w:val="24"/>
-                <w:szCs w:val="24"/>
+                <w:sz w:val="26"/>
+                <w:szCs w:val="26"/>
                 <w:lang w:val="en-US"/>
               </w:rPr>
               <w:t xml:space="preserve">Clone từ </w:t>
@@ -333,8 +345,8 @@
             <w:r>
               <w:rPr>
                 <w:rFonts w:hint="default" w:ascii="Times New Roman" w:hAnsi="Times New Roman" w:eastAsia="SimSun" w:cs="Times New Roman"/>
-                <w:sz w:val="24"/>
-                <w:szCs w:val="24"/>
+                <w:sz w:val="26"/>
+                <w:szCs w:val="26"/>
               </w:rPr>
               <w:t>Ubuntu64-bit</w:t>
             </w:r>
@@ -352,7 +364,9 @@
             <w:insideV w:val="single" w:color="auto" w:sz="4" w:space="0"/>
           </w:tblBorders>
           <w:tblCellMar>
+            <w:top w:w="0" w:type="dxa"/>
             <w:left w:w="108" w:type="dxa"/>
+            <w:bottom w:w="0" w:type="dxa"/>
             <w:right w:w="108" w:type="dxa"/>
           </w:tblCellMar>
         </w:tblPrEx>
@@ -362,6 +376,7 @@
           </w:tcPr>
           <w:p>
             <w:pPr>
+              <w:widowControl w:val="0"/>
               <w:jc w:val="both"/>
               <w:rPr>
                 <w:rFonts w:hint="default" w:ascii="Times New Roman" w:hAnsi="Times New Roman" w:cs="Times New Roman"/>
@@ -389,6 +404,7 @@
           </w:tcPr>
           <w:p>
             <w:pPr>
+              <w:widowControl w:val="0"/>
               <w:jc w:val="both"/>
               <w:rPr>
                 <w:rFonts w:hint="default" w:ascii="Times New Roman" w:hAnsi="Times New Roman" w:cs="Times New Roman"/>
@@ -422,7 +438,9 @@
             <w:insideV w:val="single" w:color="auto" w:sz="4" w:space="0"/>
           </w:tblBorders>
           <w:tblCellMar>
+            <w:top w:w="0" w:type="dxa"/>
             <w:left w:w="108" w:type="dxa"/>
+            <w:bottom w:w="0" w:type="dxa"/>
             <w:right w:w="108" w:type="dxa"/>
           </w:tblCellMar>
         </w:tblPrEx>
@@ -432,6 +450,7 @@
           </w:tcPr>
           <w:p>
             <w:pPr>
+              <w:widowControl w:val="0"/>
               <w:jc w:val="both"/>
               <w:rPr>
                 <w:rFonts w:hint="default" w:ascii="Times New Roman" w:hAnsi="Times New Roman" w:cs="Times New Roman"/>
@@ -459,6 +478,7 @@
           </w:tcPr>
           <w:p>
             <w:pPr>
+              <w:widowControl w:val="0"/>
               <w:jc w:val="both"/>
               <w:rPr>
                 <w:rFonts w:hint="default" w:ascii="Times New Roman" w:hAnsi="Times New Roman" w:cs="Times New Roman"/>
@@ -492,7 +512,9 @@
             <w:insideV w:val="single" w:color="auto" w:sz="4" w:space="0"/>
           </w:tblBorders>
           <w:tblCellMar>
+            <w:top w:w="0" w:type="dxa"/>
             <w:left w:w="108" w:type="dxa"/>
+            <w:bottom w:w="0" w:type="dxa"/>
             <w:right w:w="108" w:type="dxa"/>
           </w:tblCellMar>
         </w:tblPrEx>
@@ -502,6 +524,7 @@
           </w:tcPr>
           <w:p>
             <w:pPr>
+              <w:widowControl w:val="0"/>
               <w:jc w:val="both"/>
               <w:rPr>
                 <w:rFonts w:hint="default" w:ascii="Times New Roman" w:hAnsi="Times New Roman" w:cs="Times New Roman"/>
@@ -529,6 +552,7 @@
           </w:tcPr>
           <w:p>
             <w:pPr>
+              <w:widowControl w:val="0"/>
               <w:jc w:val="both"/>
               <w:rPr>
                 <w:rFonts w:hint="default" w:ascii="Times New Roman" w:hAnsi="Times New Roman" w:cs="Times New Roman"/>
@@ -562,7 +586,9 @@
             <w:insideV w:val="single" w:color="auto" w:sz="4" w:space="0"/>
           </w:tblBorders>
           <w:tblCellMar>
+            <w:top w:w="0" w:type="dxa"/>
             <w:left w:w="108" w:type="dxa"/>
+            <w:bottom w:w="0" w:type="dxa"/>
             <w:right w:w="108" w:type="dxa"/>
           </w:tblCellMar>
         </w:tblPrEx>
@@ -572,6 +598,7 @@
           </w:tcPr>
           <w:p>
             <w:pPr>
+              <w:widowControl w:val="0"/>
               <w:jc w:val="both"/>
               <w:rPr>
                 <w:rFonts w:hint="default" w:ascii="Times New Roman" w:hAnsi="Times New Roman" w:cs="Times New Roman"/>
@@ -599,6 +626,7 @@
           </w:tcPr>
           <w:p>
             <w:pPr>
+              <w:widowControl w:val="0"/>
               <w:jc w:val="both"/>
               <w:rPr>
                 <w:rFonts w:hint="default" w:ascii="Times New Roman" w:hAnsi="Times New Roman" w:cs="Times New Roman"/>
@@ -645,8 +673,18 @@
     <w:p>
       <w:pPr>
         <w:jc w:val="both"/>
-      </w:pPr>
-      <w:r>
+        <w:rPr>
+          <w:rFonts w:hint="default" w:ascii="Times New Roman" w:hAnsi="Times New Roman" w:cs="Times New Roman"/>
+          <w:sz w:val="26"/>
+          <w:szCs w:val="26"/>
+        </w:rPr>
+      </w:pPr>
+      <w:r>
+        <w:rPr>
+          <w:rFonts w:hint="default" w:ascii="Times New Roman" w:hAnsi="Times New Roman" w:cs="Times New Roman"/>
+          <w:sz w:val="26"/>
+          <w:szCs w:val="26"/>
+        </w:rPr>
         <w:drawing>
           <wp:inline distT="0" distB="0" distL="114300" distR="114300">
             <wp:extent cx="3582035" cy="3427095"/>
@@ -695,8 +733,18 @@
     <w:p>
       <w:pPr>
         <w:jc w:val="both"/>
-      </w:pPr>
-      <w:r>
+        <w:rPr>
+          <w:rFonts w:hint="default" w:ascii="Times New Roman" w:hAnsi="Times New Roman" w:cs="Times New Roman"/>
+          <w:sz w:val="26"/>
+          <w:szCs w:val="26"/>
+        </w:rPr>
+      </w:pPr>
+      <w:r>
+        <w:rPr>
+          <w:rFonts w:hint="default" w:ascii="Times New Roman" w:hAnsi="Times New Roman" w:cs="Times New Roman"/>
+          <w:sz w:val="26"/>
+          <w:szCs w:val="26"/>
+        </w:rPr>
         <w:drawing>
           <wp:inline distT="0" distB="0" distL="114300" distR="114300">
             <wp:extent cx="3445510" cy="2428875"/>
@@ -745,8 +793,18 @@
     <w:p>
       <w:pPr>
         <w:jc w:val="both"/>
-      </w:pPr>
-      <w:r>
+        <w:rPr>
+          <w:rFonts w:hint="default" w:ascii="Times New Roman" w:hAnsi="Times New Roman" w:cs="Times New Roman"/>
+          <w:sz w:val="26"/>
+          <w:szCs w:val="26"/>
+        </w:rPr>
+      </w:pPr>
+      <w:r>
+        <w:rPr>
+          <w:rFonts w:hint="default" w:ascii="Times New Roman" w:hAnsi="Times New Roman" w:cs="Times New Roman"/>
+          <w:sz w:val="26"/>
+          <w:szCs w:val="26"/>
+        </w:rPr>
         <w:drawing>
           <wp:inline distT="0" distB="0" distL="114300" distR="114300">
             <wp:extent cx="4105275" cy="4249420"/>
@@ -796,7 +854,640 @@
       <w:pPr>
         <w:jc w:val="both"/>
         <w:rPr>
+          <w:rFonts w:hint="default" w:ascii="Times New Roman" w:hAnsi="Times New Roman" w:cs="Times New Roman"/>
+          <w:sz w:val="26"/>
+          <w:szCs w:val="26"/>
+        </w:rPr>
+      </w:pPr>
+    </w:p>
+    <w:p>
+      <w:pPr>
+        <w:jc w:val="both"/>
+        <w:rPr>
+          <w:rFonts w:hint="default" w:ascii="Times New Roman" w:hAnsi="Times New Roman" w:cs="Times New Roman"/>
+          <w:sz w:val="26"/>
+          <w:szCs w:val="26"/>
+          <w:lang w:val="en-US"/>
+        </w:rPr>
+      </w:pPr>
+      <w:r>
+        <w:rPr>
+          <w:rFonts w:hint="default" w:ascii="Times New Roman" w:hAnsi="Times New Roman" w:cs="Times New Roman"/>
+          <w:sz w:val="26"/>
+          <w:szCs w:val="26"/>
+          <w:lang w:val="en-US"/>
+        </w:rPr>
+        <w:t>Đổi card mạng của client B và kali linux custom(vmnet9 - host only)</w:t>
+      </w:r>
+    </w:p>
+    <w:p>
+      <w:pPr>
+        <w:jc w:val="both"/>
+        <w:rPr>
+          <w:rFonts w:hint="default" w:ascii="Times New Roman" w:hAnsi="Times New Roman" w:cs="Times New Roman"/>
+          <w:sz w:val="26"/>
+          <w:szCs w:val="26"/>
+          <w:lang w:val="en-US"/>
+        </w:rPr>
+      </w:pPr>
+    </w:p>
+    <w:p>
+      <w:pPr>
+        <w:jc w:val="both"/>
+        <w:rPr>
+          <w:rFonts w:hint="default" w:ascii="Times New Roman" w:hAnsi="Times New Roman" w:eastAsia="SimSun" w:cs="Times New Roman"/>
+          <w:sz w:val="26"/>
+          <w:szCs w:val="26"/>
+        </w:rPr>
+      </w:pPr>
+      <w:r>
+        <w:rPr>
+          <w:rFonts w:hint="default" w:ascii="Times New Roman" w:hAnsi="Times New Roman" w:eastAsia="SimSun" w:cs="Times New Roman"/>
+          <w:sz w:val="26"/>
+          <w:szCs w:val="26"/>
+        </w:rPr>
+        <w:t>CẤU HÌNH PFSENSE QUA GIAO DIỆN WEB</w:t>
+      </w:r>
+    </w:p>
+    <w:p>
+      <w:pPr>
+        <w:jc w:val="both"/>
+        <w:rPr>
+          <w:rFonts w:hint="default" w:ascii="Times New Roman" w:hAnsi="Times New Roman" w:eastAsia="SimSun" w:cs="Times New Roman"/>
+          <w:sz w:val="26"/>
+          <w:szCs w:val="26"/>
+        </w:rPr>
+      </w:pPr>
+      <w:r>
+        <w:rPr>
+          <w:rFonts w:hint="default" w:ascii="Times New Roman" w:hAnsi="Times New Roman" w:eastAsia="SimSun" w:cs="Times New Roman"/>
+          <w:sz w:val="26"/>
+          <w:szCs w:val="26"/>
+        </w:rPr>
+        <w:t>Thiết lập thông số cho DNSLAB</w:t>
+      </w:r>
+    </w:p>
+    <w:p>
+      <w:pPr>
+        <w:jc w:val="both"/>
+        <w:rPr>
+          <w:rFonts w:hint="default" w:ascii="Times New Roman" w:hAnsi="Times New Roman" w:cs="Times New Roman"/>
+          <w:sz w:val="26"/>
+          <w:szCs w:val="26"/>
+        </w:rPr>
+      </w:pPr>
+      <w:r>
+        <w:rPr>
+          <w:rFonts w:hint="default" w:ascii="Times New Roman" w:hAnsi="Times New Roman" w:cs="Times New Roman"/>
+          <w:sz w:val="26"/>
+          <w:szCs w:val="26"/>
+        </w:rPr>
+        <w:drawing>
+          <wp:inline distT="0" distB="0" distL="114300" distR="114300">
+            <wp:extent cx="5266690" cy="3287395"/>
+            <wp:effectExtent l="0" t="0" r="6350" b="4445"/>
+            <wp:docPr id="4" name="Picture 1"/>
+            <wp:cNvGraphicFramePr>
+              <a:graphicFrameLocks xmlns:a="http://schemas.openxmlformats.org/drawingml/2006/main" noChangeAspect="1"/>
+            </wp:cNvGraphicFramePr>
+            <a:graphic xmlns:a="http://schemas.openxmlformats.org/drawingml/2006/main">
+              <a:graphicData uri="http://schemas.openxmlformats.org/drawingml/2006/picture">
+                <pic:pic xmlns:pic="http://schemas.openxmlformats.org/drawingml/2006/picture">
+                  <pic:nvPicPr>
+                    <pic:cNvPr id="4" name="Picture 1"/>
+                    <pic:cNvPicPr>
+                      <a:picLocks noChangeAspect="1"/>
+                    </pic:cNvPicPr>
+                  </pic:nvPicPr>
+                  <pic:blipFill>
+                    <a:blip r:embed="rId7"/>
+                    <a:stretch>
+                      <a:fillRect/>
+                    </a:stretch>
+                  </pic:blipFill>
+                  <pic:spPr>
+                    <a:xfrm>
+                      <a:off x="0" y="0"/>
+                      <a:ext cx="5266690" cy="3287395"/>
+                    </a:xfrm>
+                    <a:prstGeom prst="rect">
+                      <a:avLst/>
+                    </a:prstGeom>
+                    <a:noFill/>
+                    <a:ln>
+                      <a:noFill/>
+                    </a:ln>
+                  </pic:spPr>
+                </pic:pic>
+              </a:graphicData>
+            </a:graphic>
+          </wp:inline>
+        </w:drawing>
+      </w:r>
+    </w:p>
+    <w:p>
+      <w:pPr>
+        <w:jc w:val="both"/>
+        <w:rPr>
+          <w:rFonts w:hint="default" w:ascii="Times New Roman" w:hAnsi="Times New Roman" w:eastAsia="SimSun" w:cs="Times New Roman"/>
+          <w:sz w:val="26"/>
+          <w:szCs w:val="26"/>
+        </w:rPr>
+      </w:pPr>
+      <w:r>
+        <w:rPr>
+          <w:rFonts w:hint="default" w:ascii="Times New Roman" w:hAnsi="Times New Roman" w:eastAsia="SimSun" w:cs="Times New Roman"/>
+          <w:sz w:val="26"/>
+          <w:szCs w:val="26"/>
+        </w:rPr>
+        <w:t>Tạo Firewall Rules</w:t>
+      </w:r>
+    </w:p>
+    <w:p>
+      <w:pPr>
+        <w:jc w:val="both"/>
+        <w:rPr>
+          <w:rFonts w:hint="default" w:ascii="Times New Roman" w:hAnsi="Times New Roman" w:eastAsia="SimSun" w:cs="Times New Roman"/>
+          <w:b/>
+          <w:bCs/>
+          <w:sz w:val="26"/>
+          <w:szCs w:val="26"/>
+        </w:rPr>
+      </w:pPr>
+      <w:r>
+        <w:rPr>
+          <w:rFonts w:hint="default" w:ascii="Times New Roman" w:hAnsi="Times New Roman" w:eastAsia="SimSun" w:cs="Times New Roman"/>
+          <w:b/>
+          <w:bCs/>
+          <w:sz w:val="26"/>
+          <w:szCs w:val="26"/>
+        </w:rPr>
+        <w:t>Rule 1 (Cho phép DNS-SERVER hỏi AUTH-DNS)</w:t>
+      </w:r>
+    </w:p>
+    <w:p>
+      <w:pPr>
+        <w:jc w:val="both"/>
+        <w:rPr>
+          <w:rFonts w:hint="default" w:ascii="Times New Roman" w:hAnsi="Times New Roman" w:eastAsia="SimSun" w:cs="Times New Roman"/>
+          <w:b/>
+          <w:bCs/>
+          <w:sz w:val="26"/>
+          <w:szCs w:val="26"/>
+        </w:rPr>
+      </w:pPr>
+      <w:r>
+        <w:rPr>
+          <w:rFonts w:hint="default" w:ascii="Times New Roman" w:hAnsi="Times New Roman" w:eastAsia="SimSun" w:cs="Times New Roman"/>
+          <w:b/>
+          <w:bCs/>
+          <w:sz w:val="26"/>
+          <w:szCs w:val="26"/>
+        </w:rPr>
+        <w:t>Rule 2 (Cho phép máy trạm truy cập Web hợp lệ ở DMZ)</w:t>
+      </w:r>
+    </w:p>
+    <w:p>
+      <w:pPr>
+        <w:jc w:val="both"/>
+        <w:rPr>
+          <w:rFonts w:hint="default" w:ascii="Times New Roman" w:hAnsi="Times New Roman" w:eastAsia="SimSun" w:cs="Times New Roman"/>
+          <w:sz w:val="26"/>
+          <w:szCs w:val="26"/>
+        </w:rPr>
+      </w:pPr>
+      <w:r>
+        <w:rPr>
+          <w:rFonts w:hint="default" w:ascii="Times New Roman" w:hAnsi="Times New Roman" w:eastAsia="SimSun" w:cs="Times New Roman"/>
+          <w:sz w:val="26"/>
+          <w:szCs w:val="26"/>
+        </w:rPr>
+        <w:t>Rule 3 (Chặn truy cập mạng LAN-DOMAIN Lab 8)</w:t>
+      </w:r>
+    </w:p>
+    <w:p>
+      <w:pPr>
+        <w:jc w:val="both"/>
+        <w:rPr>
+          <w:rFonts w:hint="default" w:ascii="Times New Roman" w:hAnsi="Times New Roman" w:eastAsia="SimSun" w:cs="Times New Roman"/>
+          <w:sz w:val="26"/>
+          <w:szCs w:val="26"/>
+        </w:rPr>
+      </w:pPr>
+      <w:r>
+        <w:rPr>
+          <w:rFonts w:hint="default" w:ascii="Times New Roman" w:hAnsi="Times New Roman" w:eastAsia="SimSun" w:cs="Times New Roman"/>
+          <w:sz w:val="26"/>
+          <w:szCs w:val="26"/>
+        </w:rPr>
+        <w:t>Rule 4 (Chặn truy cập mạng MGMT)</w:t>
+      </w:r>
+    </w:p>
+    <w:p>
+      <w:pPr>
+        <w:jc w:val="both"/>
+        <w:rPr>
+          <w:rFonts w:hint="default" w:ascii="Times New Roman" w:hAnsi="Times New Roman" w:eastAsia="SimSun" w:cs="Times New Roman"/>
+          <w:sz w:val="26"/>
+          <w:szCs w:val="26"/>
+        </w:rPr>
+      </w:pPr>
+      <w:r>
+        <w:rPr>
+          <w:rFonts w:hint="default" w:ascii="Times New Roman" w:hAnsi="Times New Roman" w:eastAsia="SimSun" w:cs="Times New Roman"/>
+          <w:sz w:val="26"/>
+          <w:szCs w:val="26"/>
+        </w:rPr>
+        <w:t>Rule 5 (Chặn toàn bộ lưu lượng còn lại - Cách ly hoàn toàn)</w:t>
+      </w:r>
+    </w:p>
+    <w:p>
+      <w:pPr>
+        <w:jc w:val="both"/>
+        <w:rPr>
+          <w:rFonts w:hint="default" w:ascii="Times New Roman" w:hAnsi="Times New Roman" w:cs="Times New Roman"/>
+          <w:sz w:val="26"/>
+          <w:szCs w:val="26"/>
+        </w:rPr>
+      </w:pPr>
+      <w:r>
+        <w:rPr>
+          <w:rFonts w:hint="default" w:ascii="Times New Roman" w:hAnsi="Times New Roman" w:cs="Times New Roman"/>
+          <w:sz w:val="26"/>
+          <w:szCs w:val="26"/>
+        </w:rPr>
+        <w:drawing>
+          <wp:inline distT="0" distB="0" distL="114300" distR="114300">
+            <wp:extent cx="5273040" cy="2595880"/>
+            <wp:effectExtent l="9525" t="9525" r="20955" b="15875"/>
+            <wp:docPr id="5" name="Picture 2"/>
+            <wp:cNvGraphicFramePr>
+              <a:graphicFrameLocks xmlns:a="http://schemas.openxmlformats.org/drawingml/2006/main" noChangeAspect="1"/>
+            </wp:cNvGraphicFramePr>
+            <a:graphic xmlns:a="http://schemas.openxmlformats.org/drawingml/2006/main">
+              <a:graphicData uri="http://schemas.openxmlformats.org/drawingml/2006/picture">
+                <pic:pic xmlns:pic="http://schemas.openxmlformats.org/drawingml/2006/picture">
+                  <pic:nvPicPr>
+                    <pic:cNvPr id="5" name="Picture 2"/>
+                    <pic:cNvPicPr>
+                      <a:picLocks noChangeAspect="1"/>
+                    </pic:cNvPicPr>
+                  </pic:nvPicPr>
+                  <pic:blipFill>
+                    <a:blip r:embed="rId8"/>
+                    <a:stretch>
+                      <a:fillRect/>
+                    </a:stretch>
+                  </pic:blipFill>
+                  <pic:spPr>
+                    <a:xfrm>
+                      <a:off x="0" y="0"/>
+                      <a:ext cx="5273040" cy="2595880"/>
+                    </a:xfrm>
+                    <a:prstGeom prst="rect">
+                      <a:avLst/>
+                    </a:prstGeom>
+                    <a:noFill/>
+                    <a:ln>
+                      <a:solidFill>
+                        <a:schemeClr val="tx1"/>
+                      </a:solidFill>
+                    </a:ln>
+                  </pic:spPr>
+                </pic:pic>
+              </a:graphicData>
+            </a:graphic>
+          </wp:inline>
+        </w:drawing>
+      </w:r>
+    </w:p>
+    <w:p>
+      <w:pPr>
+        <w:jc w:val="both"/>
+        <w:rPr>
+          <w:rFonts w:hint="default" w:ascii="Times New Roman" w:hAnsi="Times New Roman" w:eastAsia="SimSun" w:cs="Times New Roman"/>
+          <w:sz w:val="26"/>
+          <w:szCs w:val="26"/>
+        </w:rPr>
+      </w:pPr>
+      <w:r>
+        <w:rPr>
+          <w:rFonts w:hint="default" w:ascii="Times New Roman" w:hAnsi="Times New Roman" w:eastAsia="SimSun" w:cs="Times New Roman"/>
+          <w:sz w:val="26"/>
+          <w:szCs w:val="26"/>
+        </w:rPr>
+        <w:t>CẤU HÌNH VÀ KIỂM TRA CÁC MÁY TRẠM</w:t>
+      </w:r>
+    </w:p>
+    <w:p>
+      <w:pPr>
+        <w:jc w:val="both"/>
+        <w:rPr>
+          <w:rFonts w:hint="default" w:ascii="Times New Roman" w:hAnsi="Times New Roman" w:eastAsia="SimSun" w:cs="Times New Roman"/>
+          <w:sz w:val="26"/>
+          <w:szCs w:val="26"/>
+        </w:rPr>
+      </w:pPr>
+      <w:r>
+        <w:rPr>
+          <w:rFonts w:hint="default" w:ascii="Times New Roman" w:hAnsi="Times New Roman" w:eastAsia="SimSun" w:cs="Times New Roman"/>
+          <w:sz w:val="26"/>
+          <w:szCs w:val="26"/>
+        </w:rPr>
+        <w:t xml:space="preserve">Trên máy DNS-SERVER (Clone từ </w:t>
+      </w:r>
+      <w:r>
+        <w:rPr>
+          <w:rStyle w:val="5"/>
+          <w:rFonts w:hint="default" w:ascii="Times New Roman" w:hAnsi="Times New Roman" w:eastAsia="SimSun" w:cs="Times New Roman"/>
+          <w:sz w:val="26"/>
+          <w:szCs w:val="26"/>
+        </w:rPr>
+        <w:t>Ubuntu64-bit</w:t>
+      </w:r>
+      <w:r>
+        <w:rPr>
+          <w:rFonts w:hint="default" w:ascii="Times New Roman" w:hAnsi="Times New Roman" w:eastAsia="SimSun" w:cs="Times New Roman"/>
+          <w:sz w:val="26"/>
+          <w:szCs w:val="26"/>
+        </w:rPr>
+        <w:t>)</w:t>
+      </w:r>
+    </w:p>
+    <w:p>
+      <w:pPr>
+        <w:jc w:val="both"/>
+        <w:rPr>
+          <w:rFonts w:hint="default" w:ascii="Times New Roman" w:hAnsi="Times New Roman" w:cs="Times New Roman"/>
+          <w:sz w:val="26"/>
+          <w:szCs w:val="26"/>
+        </w:rPr>
+      </w:pPr>
+      <w:r>
+        <w:rPr>
+          <w:rFonts w:hint="default" w:ascii="Times New Roman" w:hAnsi="Times New Roman" w:cs="Times New Roman"/>
+          <w:sz w:val="26"/>
+          <w:szCs w:val="26"/>
+        </w:rPr>
+        <w:drawing>
+          <wp:inline distT="0" distB="0" distL="114300" distR="114300">
+            <wp:extent cx="5271770" cy="3900170"/>
+            <wp:effectExtent l="0" t="0" r="1270" b="1270"/>
+            <wp:docPr id="6" name="Picture 3"/>
+            <wp:cNvGraphicFramePr>
+              <a:graphicFrameLocks xmlns:a="http://schemas.openxmlformats.org/drawingml/2006/main" noChangeAspect="1"/>
+            </wp:cNvGraphicFramePr>
+            <a:graphic xmlns:a="http://schemas.openxmlformats.org/drawingml/2006/main">
+              <a:graphicData uri="http://schemas.openxmlformats.org/drawingml/2006/picture">
+                <pic:pic xmlns:pic="http://schemas.openxmlformats.org/drawingml/2006/picture">
+                  <pic:nvPicPr>
+                    <pic:cNvPr id="6" name="Picture 3"/>
+                    <pic:cNvPicPr>
+                      <a:picLocks noChangeAspect="1"/>
+                    </pic:cNvPicPr>
+                  </pic:nvPicPr>
+                  <pic:blipFill>
+                    <a:blip r:embed="rId9"/>
+                    <a:stretch>
+                      <a:fillRect/>
+                    </a:stretch>
+                  </pic:blipFill>
+                  <pic:spPr>
+                    <a:xfrm>
+                      <a:off x="0" y="0"/>
+                      <a:ext cx="5271770" cy="3900170"/>
+                    </a:xfrm>
+                    <a:prstGeom prst="rect">
+                      <a:avLst/>
+                    </a:prstGeom>
+                    <a:noFill/>
+                    <a:ln>
+                      <a:noFill/>
+                    </a:ln>
+                  </pic:spPr>
+                </pic:pic>
+              </a:graphicData>
+            </a:graphic>
+          </wp:inline>
+        </w:drawing>
+      </w:r>
+    </w:p>
+    <w:p>
+      <w:pPr>
+        <w:jc w:val="both"/>
+        <w:rPr>
+          <w:rFonts w:hint="default" w:ascii="Times New Roman" w:hAnsi="Times New Roman" w:eastAsia="SimSun" w:cs="Times New Roman"/>
+          <w:sz w:val="26"/>
+          <w:szCs w:val="26"/>
+        </w:rPr>
+      </w:pPr>
+      <w:r>
+        <w:rPr>
+          <w:rFonts w:hint="default" w:ascii="Times New Roman" w:hAnsi="Times New Roman" w:eastAsia="SimSun" w:cs="Times New Roman"/>
+          <w:sz w:val="26"/>
+          <w:szCs w:val="26"/>
+        </w:rPr>
+        <w:t>: KIỂM TRA / CÀI ĐẶT BIND9 VÀ DNSUTILS</w:t>
+      </w:r>
+    </w:p>
+    <w:p>
+      <w:pPr>
+        <w:pStyle w:val="2"/>
+        <w:keepNext w:val="0"/>
+        <w:keepLines w:val="0"/>
+        <w:widowControl/>
+        <w:suppressLineNumbers w:val="0"/>
+        <w:shd w:val="clear" w:fill="FAF9F9"/>
+        <w:ind w:left="0" w:firstLine="0"/>
+        <w:rPr>
+          <w:rFonts w:hint="default" w:ascii="Times New Roman" w:hAnsi="Times New Roman" w:eastAsia="sans-serif" w:cs="Times New Roman"/>
+          <w:b w:val="0"/>
+          <w:bCs w:val="0"/>
+          <w:i w:val="0"/>
+          <w:iCs w:val="0"/>
+          <w:color w:val="1F1F1F"/>
+          <w:spacing w:val="0"/>
+          <w:sz w:val="26"/>
+          <w:szCs w:val="26"/>
+          <w:shd w:val="clear" w:fill="FAF9F9"/>
+        </w:rPr>
+      </w:pPr>
+      <w:r>
+        <w:rPr>
+          <w:rFonts w:hint="default" w:ascii="Times New Roman" w:hAnsi="Times New Roman" w:eastAsia="sans-serif" w:cs="Times New Roman"/>
+          <w:b w:val="0"/>
+          <w:bCs w:val="0"/>
+          <w:i w:val="0"/>
+          <w:iCs w:val="0"/>
+          <w:color w:val="1F1F1F"/>
+          <w:spacing w:val="0"/>
+          <w:sz w:val="26"/>
+          <w:szCs w:val="26"/>
+          <w:shd w:val="clear" w:fill="FAF9F9"/>
+        </w:rPr>
+        <w:t>cấu hình bind9 (named.conf.options và named.conf.local)</w:t>
+      </w:r>
+    </w:p>
+    <w:p>
+      <w:r>
+        <w:drawing>
+          <wp:inline distT="0" distB="0" distL="114300" distR="114300">
+            <wp:extent cx="5271135" cy="4198620"/>
+            <wp:effectExtent l="0" t="0" r="1905" b="7620"/>
+            <wp:docPr id="7" name="Picture 4"/>
+            <wp:cNvGraphicFramePr>
+              <a:graphicFrameLocks xmlns:a="http://schemas.openxmlformats.org/drawingml/2006/main" noChangeAspect="1"/>
+            </wp:cNvGraphicFramePr>
+            <a:graphic xmlns:a="http://schemas.openxmlformats.org/drawingml/2006/main">
+              <a:graphicData uri="http://schemas.openxmlformats.org/drawingml/2006/picture">
+                <pic:pic xmlns:pic="http://schemas.openxmlformats.org/drawingml/2006/picture">
+                  <pic:nvPicPr>
+                    <pic:cNvPr id="7" name="Picture 4"/>
+                    <pic:cNvPicPr>
+                      <a:picLocks noChangeAspect="1"/>
+                    </pic:cNvPicPr>
+                  </pic:nvPicPr>
+                  <pic:blipFill>
+                    <a:blip r:embed="rId10"/>
+                    <a:stretch>
+                      <a:fillRect/>
+                    </a:stretch>
+                  </pic:blipFill>
+                  <pic:spPr>
+                    <a:xfrm>
+                      <a:off x="0" y="0"/>
+                      <a:ext cx="5271135" cy="4198620"/>
+                    </a:xfrm>
+                    <a:prstGeom prst="rect">
+                      <a:avLst/>
+                    </a:prstGeom>
+                    <a:noFill/>
+                    <a:ln>
+                      <a:noFill/>
+                    </a:ln>
+                  </pic:spPr>
+                </pic:pic>
+              </a:graphicData>
+            </a:graphic>
+          </wp:inline>
+        </w:drawing>
+      </w:r>
+    </w:p>
+    <w:p>
+      <w:r>
+        <w:drawing>
+          <wp:inline distT="0" distB="0" distL="114300" distR="114300">
+            <wp:extent cx="5272405" cy="3750310"/>
+            <wp:effectExtent l="0" t="0" r="635" b="13970"/>
+            <wp:docPr id="8" name="Picture 5"/>
+            <wp:cNvGraphicFramePr>
+              <a:graphicFrameLocks xmlns:a="http://schemas.openxmlformats.org/drawingml/2006/main" noChangeAspect="1"/>
+            </wp:cNvGraphicFramePr>
+            <a:graphic xmlns:a="http://schemas.openxmlformats.org/drawingml/2006/main">
+              <a:graphicData uri="http://schemas.openxmlformats.org/drawingml/2006/picture">
+                <pic:pic xmlns:pic="http://schemas.openxmlformats.org/drawingml/2006/picture">
+                  <pic:nvPicPr>
+                    <pic:cNvPr id="8" name="Picture 5"/>
+                    <pic:cNvPicPr>
+                      <a:picLocks noChangeAspect="1"/>
+                    </pic:cNvPicPr>
+                  </pic:nvPicPr>
+                  <pic:blipFill>
+                    <a:blip r:embed="rId11"/>
+                    <a:stretch>
+                      <a:fillRect/>
+                    </a:stretch>
+                  </pic:blipFill>
+                  <pic:spPr>
+                    <a:xfrm>
+                      <a:off x="0" y="0"/>
+                      <a:ext cx="5272405" cy="3750310"/>
+                    </a:xfrm>
+                    <a:prstGeom prst="rect">
+                      <a:avLst/>
+                    </a:prstGeom>
+                    <a:noFill/>
+                    <a:ln>
+                      <a:noFill/>
+                    </a:ln>
+                  </pic:spPr>
+                </pic:pic>
+              </a:graphicData>
+            </a:graphic>
+          </wp:inline>
+        </w:drawing>
+      </w:r>
+    </w:p>
+    <w:p>
+      <w:r>
+        <w:drawing>
+          <wp:inline distT="0" distB="0" distL="114300" distR="114300">
+            <wp:extent cx="5052060" cy="3848100"/>
+            <wp:effectExtent l="0" t="0" r="7620" b="7620"/>
+            <wp:docPr id="9" name="Picture 6"/>
+            <wp:cNvGraphicFramePr>
+              <a:graphicFrameLocks xmlns:a="http://schemas.openxmlformats.org/drawingml/2006/main" noChangeAspect="1"/>
+            </wp:cNvGraphicFramePr>
+            <a:graphic xmlns:a="http://schemas.openxmlformats.org/drawingml/2006/main">
+              <a:graphicData uri="http://schemas.openxmlformats.org/drawingml/2006/picture">
+                <pic:pic xmlns:pic="http://schemas.openxmlformats.org/drawingml/2006/picture">
+                  <pic:nvPicPr>
+                    <pic:cNvPr id="9" name="Picture 6"/>
+                    <pic:cNvPicPr>
+                      <a:picLocks noChangeAspect="1"/>
+                    </pic:cNvPicPr>
+                  </pic:nvPicPr>
+                  <pic:blipFill>
+                    <a:blip r:embed="rId12"/>
+                    <a:stretch>
+                      <a:fillRect/>
+                    </a:stretch>
+                  </pic:blipFill>
+                  <pic:spPr>
+                    <a:xfrm>
+                      <a:off x="0" y="0"/>
+                      <a:ext cx="5052060" cy="3848100"/>
+                    </a:xfrm>
+                    <a:prstGeom prst="rect">
+                      <a:avLst/>
+                    </a:prstGeom>
+                    <a:noFill/>
+                    <a:ln>
+                      <a:noFill/>
+                    </a:ln>
+                  </pic:spPr>
+                </pic:pic>
+              </a:graphicData>
+            </a:graphic>
+          </wp:inline>
+        </w:drawing>
+      </w:r>
+    </w:p>
+    <w:p>
+      <w:pPr>
+        <w:rPr>
           <w:rFonts w:hint="default"/>
+        </w:rPr>
+      </w:pPr>
+      <w:bookmarkStart w:id="0" w:name="_GoBack"/>
+      <w:bookmarkEnd w:id="0"/>
+    </w:p>
+    <w:p>
+      <w:pPr>
+        <w:rPr>
+          <w:rFonts w:hint="default"/>
+          <w:sz w:val="26"/>
+          <w:szCs w:val="26"/>
+        </w:rPr>
+      </w:pPr>
+    </w:p>
+    <w:p>
+      <w:pPr>
+        <w:jc w:val="both"/>
+        <w:rPr>
+          <w:rFonts w:hint="default" w:ascii="Times New Roman" w:hAnsi="Times New Roman" w:eastAsia="SimSun" w:cs="Times New Roman"/>
+          <w:sz w:val="26"/>
+          <w:szCs w:val="26"/>
           <w:lang w:val="en-US"/>
         </w:rPr>
       </w:pPr>
@@ -907,7 +1598,7 @@
     <w:lsdException w:unhideWhenUsed="0" w:uiPriority="0" w:semiHidden="0" w:name="Body Text Indent 2"/>
     <w:lsdException w:unhideWhenUsed="0" w:uiPriority="0" w:semiHidden="0" w:name="Body Text Indent 3"/>
     <w:lsdException w:unhideWhenUsed="0" w:uiPriority="0" w:semiHidden="0" w:name="Block Text"/>
-    <w:lsdException w:unhideWhenUsed="0" w:uiPriority="0" w:semiHidden="0" w:name="Hyperlink"/>
+    <w:lsdException w:qFormat="1" w:unhideWhenUsed="0" w:uiPriority="0" w:semiHidden="0" w:name="Hyperlink"/>
     <w:lsdException w:unhideWhenUsed="0" w:uiPriority="0" w:semiHidden="0" w:name="FollowedHyperlink"/>
     <w:lsdException w:qFormat="1" w:unhideWhenUsed="0" w:uiPriority="0" w:semiHidden="0" w:name="Strong"/>
     <w:lsdException w:qFormat="1" w:unhideWhenUsed="0" w:uiPriority="0" w:semiHidden="0" w:name="Emphasis"/>
@@ -925,7 +1616,7 @@
     <w:lsdException w:unhideWhenUsed="0" w:uiPriority="0" w:semiHidden="0" w:name="HTML Sample"/>
     <w:lsdException w:unhideWhenUsed="0" w:uiPriority="0" w:semiHidden="0" w:name="HTML Typewriter"/>
     <w:lsdException w:unhideWhenUsed="0" w:uiPriority="0" w:semiHidden="0" w:name="HTML Variable"/>
-    <w:lsdException w:unhideWhenUsed="0" w:uiPriority="0" w:name="Normal Table"/>
+    <w:lsdException w:qFormat="1" w:unhideWhenUsed="0" w:uiPriority="0" w:name="Normal Table"/>
     <w:lsdException w:unhideWhenUsed="0" w:uiPriority="0" w:semiHidden="0" w:name="annotation subject"/>
     <w:lsdException w:unhideWhenUsed="0" w:uiPriority="0" w:semiHidden="0" w:name="Table Simple 1"/>
     <w:lsdException w:unhideWhenUsed="0" w:uiPriority="0" w:semiHidden="0" w:name="Table Simple 2"/>
@@ -970,7 +1661,7 @@
     <w:lsdException w:unhideWhenUsed="0" w:uiPriority="0" w:semiHidden="0" w:name="Table Web 2"/>
     <w:lsdException w:unhideWhenUsed="0" w:uiPriority="0" w:semiHidden="0" w:name="Table Web 3"/>
     <w:lsdException w:unhideWhenUsed="0" w:uiPriority="0" w:semiHidden="0" w:name="Balloon Text"/>
-    <w:lsdException w:unhideWhenUsed="0" w:uiPriority="0" w:semiHidden="0" w:name="Table Grid"/>
+    <w:lsdException w:qFormat="1" w:unhideWhenUsed="0" w:uiPriority="0" w:semiHidden="0" w:name="Table Grid"/>
     <w:lsdException w:unhideWhenUsed="0" w:uiPriority="0" w:semiHidden="0" w:name="Table Theme"/>
     <w:lsdException w:unhideWhenUsed="0" w:uiPriority="60" w:semiHidden="0" w:name="Light Shading"/>
     <w:lsdException w:unhideWhenUsed="0" w:uiPriority="61" w:semiHidden="0" w:name="Light List"/>
@@ -1080,15 +1771,37 @@
       <w:lang w:val="en-US" w:eastAsia="zh-CN" w:bidi="ar-SA"/>
     </w:rPr>
   </w:style>
-  <w:style w:type="character" w:default="1" w:styleId="2">
+  <w:style w:type="paragraph" w:styleId="2">
+    <w:name w:val="heading 3"/>
+    <w:next w:val="1"/>
+    <w:semiHidden/>
+    <w:unhideWhenUsed/>
+    <w:qFormat/>
+    <w:uiPriority w:val="0"/>
+    <w:pPr>
+      <w:spacing w:before="0" w:beforeAutospacing="1" w:after="0" w:afterAutospacing="1"/>
+      <w:jc w:val="left"/>
+    </w:pPr>
+    <w:rPr>
+      <w:rFonts w:hint="eastAsia" w:ascii="SimSun" w:hAnsi="SimSun" w:eastAsia="SimSun" w:cs="SimSun"/>
+      <w:b/>
+      <w:bCs/>
+      <w:kern w:val="0"/>
+      <w:sz w:val="27"/>
+      <w:szCs w:val="27"/>
+      <w:lang w:val="en-US" w:eastAsia="zh-CN" w:bidi="ar"/>
+    </w:rPr>
+  </w:style>
+  <w:style w:type="character" w:default="1" w:styleId="3">
     <w:name w:val="Default Paragraph Font"/>
     <w:semiHidden/>
     <w:qFormat/>
     <w:uiPriority w:val="0"/>
   </w:style>
-  <w:style w:type="table" w:default="1" w:styleId="3">
+  <w:style w:type="table" w:default="1" w:styleId="4">
     <w:name w:val="Normal Table"/>
     <w:semiHidden/>
+    <w:qFormat/>
     <w:uiPriority w:val="0"/>
     <w:tblPr>
       <w:tblCellMar>
@@ -1099,18 +1812,30 @@
       </w:tblCellMar>
     </w:tblPr>
   </w:style>
-  <w:style w:type="character" w:styleId="4">
+  <w:style w:type="character" w:styleId="5">
+    <w:name w:val="HTML Code"/>
+    <w:basedOn w:val="3"/>
+    <w:uiPriority w:val="0"/>
+    <w:rPr>
+      <w:rFonts w:ascii="Courier New" w:hAnsi="Courier New" w:cs="Courier New"/>
+      <w:sz w:val="20"/>
+      <w:szCs w:val="20"/>
+    </w:rPr>
+  </w:style>
+  <w:style w:type="character" w:styleId="6">
     <w:name w:val="Hyperlink"/>
-    <w:basedOn w:val="2"/>
+    <w:basedOn w:val="3"/>
+    <w:qFormat/>
     <w:uiPriority w:val="0"/>
     <w:rPr>
       <w:color w:val="0000FF"/>
       <w:u w:val="single"/>
     </w:rPr>
   </w:style>
-  <w:style w:type="table" w:styleId="5">
+  <w:style w:type="table" w:styleId="7">
     <w:name w:val="Table Grid"/>
-    <w:basedOn w:val="3"/>
+    <w:basedOn w:val="4"/>
+    <w:qFormat/>
     <w:uiPriority w:val="0"/>
     <w:pPr>
       <w:widowControl w:val="0"/>

</xml_diff>

<commit_message>
bổ sung nôi dung
</commit_message>
<xml_diff>
--- a/LAB8/11_ĐH_CNPM2-LAB8_1150080113-ChauThiNgocQuyen.docx
+++ b/LAB8/11_ĐH_CNPM2-LAB8_1150080113-ChauThiNgocQuyen.docx
@@ -67,6 +67,96 @@
         </w:rPr>
         <w:fldChar w:fldCharType="end"/>
       </w:r>
+    </w:p>
+    <w:p>
+      <w:pPr>
+        <w:ind w:firstLine="720" w:firstLineChars="0"/>
+        <w:jc w:val="both"/>
+        <w:rPr>
+          <w:rFonts w:hint="default" w:ascii="Times New Roman" w:hAnsi="Times New Roman" w:cs="Times New Roman"/>
+          <w:sz w:val="26"/>
+          <w:szCs w:val="26"/>
+          <w:lang w:val="en-US"/>
+        </w:rPr>
+      </w:pPr>
+      <w:r>
+        <w:rPr>
+          <w:rFonts w:hint="default" w:ascii="Times New Roman" w:hAnsi="Times New Roman" w:cs="Times New Roman"/>
+          <w:sz w:val="26"/>
+          <w:szCs w:val="26"/>
+          <w:lang w:val="en-US"/>
+        </w:rPr>
+        <w:t xml:space="preserve">- Video (bổ sung) </w:t>
+      </w:r>
+      <w:bookmarkStart w:id="0" w:name="_GoBack"/>
+      <w:bookmarkEnd w:id="0"/>
+      <w:r>
+        <w:rPr>
+          <w:rFonts w:hint="default" w:ascii="Times New Roman" w:hAnsi="Times New Roman" w:cs="Times New Roman"/>
+          <w:sz w:val="26"/>
+          <w:szCs w:val="26"/>
+          <w:lang w:val="en-US"/>
+        </w:rPr>
+        <w:t xml:space="preserve"> </w:t>
+      </w:r>
+      <w:r>
+        <w:rPr>
+          <w:rFonts w:hint="default" w:ascii="Times New Roman" w:hAnsi="Times New Roman" w:cs="Times New Roman"/>
+          <w:sz w:val="26"/>
+          <w:szCs w:val="26"/>
+          <w:lang w:val="en-US"/>
+        </w:rPr>
+        <w:fldChar w:fldCharType="begin"/>
+      </w:r>
+      <w:r>
+        <w:rPr>
+          <w:rFonts w:hint="default" w:ascii="Times New Roman" w:hAnsi="Times New Roman" w:cs="Times New Roman"/>
+          <w:sz w:val="26"/>
+          <w:szCs w:val="26"/>
+          <w:lang w:val="en-US"/>
+        </w:rPr>
+        <w:instrText xml:space="preserve"> HYPERLINK "https://youtu.be/HIKJTvosS8g" </w:instrText>
+      </w:r>
+      <w:r>
+        <w:rPr>
+          <w:rFonts w:hint="default" w:ascii="Times New Roman" w:hAnsi="Times New Roman" w:cs="Times New Roman"/>
+          <w:sz w:val="26"/>
+          <w:szCs w:val="26"/>
+          <w:lang w:val="en-US"/>
+        </w:rPr>
+        <w:fldChar w:fldCharType="separate"/>
+      </w:r>
+      <w:r>
+        <w:rPr>
+          <w:rStyle w:val="6"/>
+          <w:rFonts w:hint="default" w:ascii="Times New Roman" w:hAnsi="Times New Roman" w:cs="Times New Roman"/>
+          <w:sz w:val="26"/>
+          <w:szCs w:val="26"/>
+          <w:lang w:val="en-US"/>
+        </w:rPr>
+        <w:t>https://youtu.be/HIKJTvosS8g</w:t>
+      </w:r>
+      <w:r>
+        <w:rPr>
+          <w:rFonts w:hint="default" w:ascii="Times New Roman" w:hAnsi="Times New Roman" w:cs="Times New Roman"/>
+          <w:sz w:val="26"/>
+          <w:szCs w:val="26"/>
+          <w:lang w:val="en-US"/>
+        </w:rPr>
+        <w:fldChar w:fldCharType="end"/>
+      </w:r>
+    </w:p>
+    <w:p>
+      <w:pPr>
+        <w:ind w:firstLine="720" w:firstLineChars="0"/>
+        <w:jc w:val="both"/>
+        <w:rPr>
+          <w:rFonts w:hint="default" w:ascii="Times New Roman" w:hAnsi="Times New Roman" w:cs="Times New Roman"/>
+          <w:sz w:val="26"/>
+          <w:szCs w:val="26"/>
+          <w:lang w:val="en-US"/>
+        </w:rPr>
+      </w:pPr>
     </w:p>
     <w:p>
       <w:pPr>
@@ -1469,8 +1559,6 @@
           <w:rFonts w:hint="default"/>
         </w:rPr>
       </w:pPr>
-      <w:bookmarkStart w:id="0" w:name="_GoBack"/>
-      <w:bookmarkEnd w:id="0"/>
     </w:p>
     <w:p>
       <w:pPr>

</xml_diff>